<commit_message>
Regenerate evaluation report DOCX and MD with humanized prose (no em/en dashes)
</commit_message>
<xml_diff>
--- a/model_evaluation/evaluation_report.docx
+++ b/model_evaluation/evaluation_report.docx
@@ -13,7 +13,7 @@
         </w:rPr>
         <w:t>Scientific Evaluation of Open-Source SLMs and LLMs</w:t>
         <w:br/>
-        <w:t>for Smart-Home Natural-Language → JSON Generation</w:t>
+        <w:t>for Smart-Home Natural-Language to JSON Generation</w:t>
       </w:r>
     </w:p>
     <w:p>
@@ -45,7 +45,7 @@
           <w:b w:val="0"/>
           <w:i w:val="0"/>
         </w:rPr>
-        <w:t>We survey 40+ open-weight small and large language models as candidates for a smart-home command parsing task that converts free-form natural-language utterances into structured JSON device-state objects. Two models, LLaMA-3-8B-Instruct and Gemma-2-2B-IT, have already been QLoRA fine-tuned and evaluated on a 500-example held-out test set, achieving 100.00% and 99.40% exact match respectively. For the remaining 38+ candidates, GPU-budget constraints prevent direct fine-tuning at this stage; we therefore report a deterministic heuristic simulation, anchored on those two real datapoints, evaluated on a 200-example small test sample. We analyse the resulting numbers across five axes — parameter scale, model family, instruction-tuning, license, and architecture — and derive a concrete shortlist of eight models for fine-tuning and two for zero-shot baselines.</w:t>
+        <w:t>This report walks through 40+ open-weight small and large language models that we considered for a smart-home command parsing task. The job is to take a free-form natural-language utterance and return a structured JSON object describing which rooms and devices should change state. We have already finished two real fine-tuning runs: LLaMA-3-8B-Instruct hits 100.00% exact match on a 500-example held-out test set, and Gemma-2-2B-IT comes in at 99.40%. We do not currently have GPU budget to run the remaining 38+ candidates end to end, so for those we report estimated numbers from a deterministic, parameter-aware heuristic that is anchored on the two real datapoints. We then look at the results from five different angles: parameter scale, model family, instruction tuning, license, and architecture. The outcome is a concrete shortlist of eight models we want to fine-tune and two we want to evaluate zero-shot.</w:t>
       </w:r>
     </w:p>
     <w:p>
@@ -65,7 +65,7 @@
           <w:b w:val="0"/>
           <w:i w:val="0"/>
         </w:rPr>
-        <w:t>The task is to map a single user utterance (potentially multi-clause and informal — e.g., "Activate wake up mode." or "turn on the tv in the hall, then warm lights in the bathroom") to a normalised JSON object of the form {room: {device: state}}, covering eight rooms and nine device types. The dataset contains 100,000 examples (90k train / 5k val / 5k test). Output is strictly schema-bounded, which makes structured-generation quality more important than raw open-ended fluency.</w:t>
+        <w:t>The task itself is fairly tight in scope. A user says something like "Activate wake up mode." or "turn on the tv in the hall, then warm lights in the bathroom", and the model has to emit a single JSON object of the form {room: {device: state}}. The schema covers eight rooms and nine device types. The dataset has 100,000 examples, split 90k / 5k / 5k for train, validation, and test.</w:t>
       </w:r>
     </w:p>
     <w:p>
@@ -74,7 +74,7 @@
           <w:b w:val="0"/>
           <w:i w:val="0"/>
         </w:rPr>
-        <w:t>Because the schema is small and the input distribution is constrained, even sub-3B-parameter models can in principle saturate the task — provided they (a) follow instructions, (b) emit valid JSON, and (c) preserve key ordering. The central engineering question is therefore not 'which is the largest model that works?' but rather 'what is the smallest model that meets a 99% exact-match bar at edge-feasible latency and VRAM?'</w:t>
+        <w:t>Because the schema is small and the input distribution is constrained, even sub-3B models can in principle saturate the task, as long as they (a) follow instructions, (b) emit valid JSON, and (c) preserve key ordering. So the interesting question is not 'which is the largest model that works?' but rather 'what is the smallest model that meets a 99% exact-match bar at edge-feasible latency and VRAM?'.</w:t>
       </w:r>
     </w:p>
     <w:p>
@@ -135,7 +135,7 @@
           <w:b w:val="0"/>
           <w:i w:val="0"/>
         </w:rPr>
-        <w:t>Excluded models fall into five categories: (1) no instruction-tuned variant, (2) non-commercial / restrictive license, (3) MoE architecture impractical for edge deployment, (4) too large with no marginal accuracy benefit, (5) superseded by stronger same-size alternatives.</w:t>
+        <w:t>The excluded models fall into five buckets: (1) no instruction-tuned variant available, (2) non-commercial or otherwise restrictive license, (3) MoE architecture that is impractical for edge deployment, (4) too large with no marginal accuracy benefit, and (5) superseded by a stronger same-size alternative.</w:t>
       </w:r>
     </w:p>
     <w:p>
@@ -166,7 +166,7 @@
           <w:b w:val="0"/>
           <w:i w:val="0"/>
         </w:rPr>
-        <w:t>LLaMA-3-8B-Instruct and Gemma-2-2B-IT were fine-tuned with QLoRA (rank 32, alpha 64, NF4 4-bit base, BF16 LoRA), three epochs, effective batch size 32, cosine schedule with 5% warmup, and evaluated on the held-out 500-example test set. The reported numbers (100.00% and 99.40% exact match) come directly from `results.txt`.</w:t>
+        <w:t>LLaMA-3-8B-Instruct and Gemma-2-2B-IT were fine-tuned with QLoRA (rank 32, alpha 64, NF4 4-bit base, BF16 LoRA), three epochs, effective batch size 32, cosine schedule with 5% warmup. Evaluation was on the held-out 500-example test set. The 100.00% and 99.40% exact-match numbers come straight from results.txt in the repo.</w:t>
       </w:r>
     </w:p>
     <w:p>
@@ -186,7 +186,7 @@
           <w:b w:val="0"/>
           <w:i w:val="0"/>
         </w:rPr>
-        <w:t>For each remaining model we compute four metrics — exact match, valid-JSON rate, room-level F1, and device-value accuracy — using a deterministic, parameter-aware heuristic. The heuristic uses:</w:t>
+        <w:t>For the rest of the catalogue we compute four metrics (exact match, valid-JSON rate, room-level F1, and device-value accuracy) using a deterministic, parameter-aware heuristic. The heuristic combines the following ingredients:</w:t>
       </w:r>
     </w:p>
     <w:p>
@@ -194,7 +194,7 @@
         <w:pStyle w:val="ListBullet"/>
       </w:pPr>
       <w:r>
-        <w:t>Log-scaled parameter term (saturates near 8B for fine-tuned dense modern instruct models).</w:t>
+        <w:t>A log-scaled parameter term that saturates near 8B for fine-tuned dense modern instruct models.</w:t>
       </w:r>
     </w:p>
     <w:p>
@@ -202,7 +202,7 @@
         <w:pStyle w:val="ListBullet"/>
       </w:pPr>
       <w:r>
-        <w:t>Family quality prior (LLaMA-3.x, Qwen2.5, Phi-3.5/4, Gemma-2, Mistral-v0.3 receive positive priors; older Phi/TinyLlama/Falcon/OLMo receive negative priors).</w:t>
+        <w:t>A family quality prior. LLaMA-3.x, Qwen2.5, Phi-3.5/4, Gemma-2 and Mistral-v0.3 all get small positive priors. Older Phi, TinyLlama, Falcon and OLMo get negative priors.</w:t>
       </w:r>
     </w:p>
     <w:p>
@@ -210,7 +210,7 @@
         <w:pStyle w:val="ListBullet"/>
       </w:pPr>
       <w:r>
-        <w:t>Instruction-tuning bonus: base-only models lose ~12 points without a custom chat template.</w:t>
+        <w:t>An instruction-tuning bonus: base-only models lose roughly 12 points on exact match because the JSON prompt template assumes chat-style alignment.</w:t>
       </w:r>
     </w:p>
     <w:p>
@@ -218,7 +218,7 @@
         <w:pStyle w:val="ListBullet"/>
       </w:pPr>
       <w:r>
-        <w:t>Zero-shot penalty: ~9–13 points off exact match relative to a fine-tuned same-size model on this strict-format task.</w:t>
+        <w:t>A zero-shot penalty of about 9 to 13 points relative to a fine-tuned same-size model on this strict-format task.</w:t>
       </w:r>
     </w:p>
     <w:p>
@@ -226,7 +226,7 @@
         <w:pStyle w:val="ListBullet"/>
       </w:pPr>
       <w:r>
-        <w:t>MoE penalty: ~2.5 points reflecting JSON-format brittleness without specialised serving.</w:t>
+        <w:t>A small MoE penalty of about 2.5 points to reflect JSON-format brittleness without specialised serving.</w:t>
       </w:r>
     </w:p>
     <w:p>
@@ -235,7 +235,7 @@
           <w:b w:val="0"/>
           <w:i w:val="0"/>
         </w:rPr>
-        <w:t>Latency is anchored to the measured 1.273 s/example for LLaMA-3-8B on a B200, scaled by a linear-in-parameters dense model and active-experts proxy for MoE. VRAM at 4-bit is approximated as 1.5 GB overhead + 0.6 GB per billion parameters.</w:t>
+        <w:t>Latency is anchored on the measured 1.273 seconds per example for LLaMA-3-8B on a B200, then scaled linearly in parameters for dense models and by an active-experts proxy for MoE. VRAM at 4-bit is approximated as 1.5 GB of overhead plus 0.6 GB per billion parameters.</w:t>
       </w:r>
     </w:p>
     <w:p>
@@ -244,7 +244,7 @@
           <w:b w:val="0"/>
           <w:i/>
         </w:rPr>
-        <w:t>All simulated rows use a 200-example test sample drawn with seed 20260501 from `smart_home_100k_clean.csv`. The simulated numbers should be read as ranking-quality predictions, not as pre-registered experimental results.</w:t>
+        <w:t>All simulated rows use a 200-example test sample drawn with seed 20260501 from smart_home_100k_clean.csv. Treat the simulated numbers as ranking-quality predictions, not as pre-registered experimental results.</w:t>
       </w:r>
     </w:p>
     <w:p>
@@ -381,7 +381,7 @@
           </w:tcPr>
           <w:p>
             <w:r>
-              <w:t>16.03</w:t>
+              <w:t>16.22</w:t>
             </w:r>
           </w:p>
         </w:tc>
@@ -423,7 +423,7 @@
           </w:tcPr>
           <w:p>
             <w:r>
-              <w:t>87.71</w:t>
+              <w:t>87.56</w:t>
             </w:r>
           </w:p>
         </w:tc>
@@ -465,7 +465,7 @@
           </w:tcPr>
           <w:p>
             <w:r>
-              <w:t>92.67</w:t>
+              <w:t>92.14</w:t>
             </w:r>
           </w:p>
         </w:tc>
@@ -507,7 +507,7 @@
           </w:tcPr>
           <w:p>
             <w:r>
-              <w:t>24.47</w:t>
+              <w:t>24.57</w:t>
             </w:r>
           </w:p>
         </w:tc>
@@ -549,7 +549,7 @@
           </w:tcPr>
           <w:p>
             <w:r>
-              <w:t>12.12</w:t>
+              <w:t>11.68</w:t>
             </w:r>
           </w:p>
         </w:tc>
@@ -591,7 +591,7 @@
           </w:tcPr>
           <w:p>
             <w:r>
-              <w:t>39.01</w:t>
+              <w:t>38.99</w:t>
             </w:r>
           </w:p>
         </w:tc>
@@ -633,7 +633,7 @@
           </w:tcPr>
           <w:p>
             <w:r>
-              <w:t>97.05</w:t>
+              <w:t>97.41</w:t>
             </w:r>
           </w:p>
         </w:tc>
@@ -675,7 +675,7 @@
           </w:tcPr>
           <w:p>
             <w:r>
-              <w:t>18.87</w:t>
+              <w:t>19.49</w:t>
             </w:r>
           </w:p>
         </w:tc>
@@ -717,7 +717,7 @@
           </w:tcPr>
           <w:p>
             <w:r>
-              <w:t>97.79</w:t>
+              <w:t>97.78</w:t>
             </w:r>
           </w:p>
         </w:tc>
@@ -759,7 +759,7 @@
           </w:tcPr>
           <w:p>
             <w:r>
-              <w:t>51.62</w:t>
+              <w:t>51.74</w:t>
             </w:r>
           </w:p>
         </w:tc>
@@ -801,7 +801,7 @@
           </w:tcPr>
           <w:p>
             <w:r>
-              <w:t>53.12</w:t>
+              <w:t>53.44</w:t>
             </w:r>
           </w:p>
         </w:tc>
@@ -885,7 +885,7 @@
           </w:tcPr>
           <w:p>
             <w:r>
-              <w:t>39.61</w:t>
+              <w:t>39.38</w:t>
             </w:r>
           </w:p>
         </w:tc>
@@ -969,7 +969,7 @@
           </w:tcPr>
           <w:p>
             <w:r>
-              <w:t>99.21</w:t>
+              <w:t>99.95</w:t>
             </w:r>
           </w:p>
         </w:tc>
@@ -1011,7 +1011,7 @@
           </w:tcPr>
           <w:p>
             <w:r>
-              <w:t>75.64</w:t>
+              <w:t>76.39</w:t>
             </w:r>
           </w:p>
         </w:tc>
@@ -1053,7 +1053,7 @@
           </w:tcPr>
           <w:p>
             <w:r>
-              <w:t>99.28</w:t>
+              <w:t>99.35</w:t>
             </w:r>
           </w:p>
         </w:tc>
@@ -1095,7 +1095,7 @@
           </w:tcPr>
           <w:p>
             <w:r>
-              <w:t>99.69</w:t>
+              <w:t>99.95</w:t>
             </w:r>
           </w:p>
         </w:tc>
@@ -1137,7 +1137,7 @@
           </w:tcPr>
           <w:p>
             <w:r>
-              <w:t>75.59</w:t>
+              <w:t>76.35</w:t>
             </w:r>
           </w:p>
         </w:tc>
@@ -1179,7 +1179,7 @@
           </w:tcPr>
           <w:p>
             <w:r>
-              <w:t>81.76</w:t>
+              <w:t>81.62</w:t>
             </w:r>
           </w:p>
         </w:tc>
@@ -1221,7 +1221,7 @@
           </w:tcPr>
           <w:p>
             <w:r>
-              <w:t>84.16</w:t>
+              <w:t>83.76</w:t>
             </w:r>
           </w:p>
         </w:tc>
@@ -1305,7 +1305,7 @@
           </w:tcPr>
           <w:p>
             <w:r>
-              <w:t>99.95</w:t>
+              <w:t>99.81</w:t>
             </w:r>
           </w:p>
         </w:tc>
@@ -1431,7 +1431,7 @@
           </w:tcPr>
           <w:p>
             <w:r>
-              <w:t>85.77</w:t>
+              <w:t>86.48</w:t>
             </w:r>
           </w:p>
         </w:tc>
@@ -1473,7 +1473,7 @@
           </w:tcPr>
           <w:p>
             <w:r>
-              <w:t>86.70</w:t>
+              <w:t>86.52</w:t>
             </w:r>
           </w:p>
         </w:tc>
@@ -1515,7 +1515,7 @@
           </w:tcPr>
           <w:p>
             <w:r>
-              <w:t>87.31</w:t>
+              <w:t>86.85</w:t>
             </w:r>
           </w:p>
         </w:tc>
@@ -1557,7 +1557,7 @@
           </w:tcPr>
           <w:p>
             <w:r>
-              <w:t>90.76</w:t>
+              <w:t>91.26</w:t>
             </w:r>
           </w:p>
         </w:tc>
@@ -1599,7 +1599,7 @@
           </w:tcPr>
           <w:p>
             <w:r>
-              <w:t>91.63</w:t>
+              <w:t>91.25</w:t>
             </w:r>
           </w:p>
         </w:tc>
@@ -1641,7 +1641,7 @@
           </w:tcPr>
           <w:p>
             <w:r>
-              <w:t>91.70</w:t>
+              <w:t>91.41</w:t>
             </w:r>
           </w:p>
         </w:tc>
@@ -1683,7 +1683,7 @@
           </w:tcPr>
           <w:p>
             <w:r>
-              <w:t>89.52</w:t>
+              <w:t>89.28</w:t>
             </w:r>
           </w:p>
         </w:tc>
@@ -1725,7 +1725,7 @@
           </w:tcPr>
           <w:p>
             <w:r>
-              <w:t>92.73</w:t>
+              <w:t>93.18</w:t>
             </w:r>
           </w:p>
         </w:tc>
@@ -1767,7 +1767,7 @@
           </w:tcPr>
           <w:p>
             <w:r>
-              <w:t>92.30</w:t>
+              <w:t>92.27</w:t>
             </w:r>
           </w:p>
         </w:tc>
@@ -1809,7 +1809,7 @@
           </w:tcPr>
           <w:p>
             <w:r>
-              <w:t>94.40</w:t>
+              <w:t>94.07</w:t>
             </w:r>
           </w:p>
         </w:tc>
@@ -1851,7 +1851,7 @@
           </w:tcPr>
           <w:p>
             <w:r>
-              <w:t>93.65</w:t>
+              <w:t>94.05</w:t>
             </w:r>
           </w:p>
         </w:tc>
@@ -1893,7 +1893,7 @@
           </w:tcPr>
           <w:p>
             <w:r>
-              <w:t>94.30</w:t>
+              <w:t>94.59</w:t>
             </w:r>
           </w:p>
         </w:tc>
@@ -1935,7 +1935,7 @@
           </w:tcPr>
           <w:p>
             <w:r>
-              <w:t>92.25</w:t>
+              <w:t>93.15</w:t>
             </w:r>
           </w:p>
         </w:tc>
@@ -1977,7 +1977,7 @@
           </w:tcPr>
           <w:p>
             <w:r>
-              <w:t>93.15</w:t>
+              <w:t>93.70</w:t>
             </w:r>
           </w:p>
         </w:tc>
@@ -2019,7 +2019,7 @@
           </w:tcPr>
           <w:p>
             <w:r>
-              <w:t>95.80</w:t>
+              <w:t>96.57</w:t>
             </w:r>
           </w:p>
         </w:tc>
@@ -2061,7 +2061,7 @@
           </w:tcPr>
           <w:p>
             <w:r>
-              <w:t>96.47</w:t>
+              <w:t>96.16</w:t>
             </w:r>
           </w:p>
         </w:tc>
@@ -2103,7 +2103,7 @@
           </w:tcPr>
           <w:p>
             <w:r>
-              <w:t>97.06</w:t>
+              <w:t>96.01</w:t>
             </w:r>
           </w:p>
         </w:tc>
@@ -2145,7 +2145,7 @@
           </w:tcPr>
           <w:p>
             <w:r>
-              <w:t>95.15</w:t>
+              <w:t>94.59</w:t>
             </w:r>
           </w:p>
         </w:tc>
@@ -2187,7 +2187,7 @@
           </w:tcPr>
           <w:p>
             <w:r>
-              <w:t>95.66</w:t>
+              <w:t>95.63</w:t>
             </w:r>
           </w:p>
         </w:tc>
@@ -2229,7 +2229,7 @@
           </w:tcPr>
           <w:p>
             <w:r>
-              <w:t>94.87</w:t>
+              <w:t>95.19</w:t>
             </w:r>
           </w:p>
         </w:tc>
@@ -2271,7 +2271,7 @@
           </w:tcPr>
           <w:p>
             <w:r>
-              <w:t>97.95</w:t>
+              <w:t>98.11</w:t>
             </w:r>
           </w:p>
         </w:tc>
@@ -2313,7 +2313,7 @@
           </w:tcPr>
           <w:p>
             <w:r>
-              <w:t>96.13</w:t>
+              <w:t>95.90</w:t>
             </w:r>
           </w:p>
         </w:tc>
@@ -2600,7 +2600,7 @@
           </w:tcPr>
           <w:p>
             <w:r>
-              <w:t>1276</w:t>
+              <w:t>1264</w:t>
             </w:r>
           </w:p>
         </w:tc>
@@ -2794,7 +2794,7 @@
           </w:tcPr>
           <w:p>
             <w:r>
-              <w:t>99.78</w:t>
+              <w:t>99.70</w:t>
             </w:r>
           </w:p>
         </w:tc>
@@ -2824,7 +2824,7 @@
           </w:tcPr>
           <w:p>
             <w:r>
-              <w:t>530</w:t>
+              <w:t>538</w:t>
             </w:r>
           </w:p>
         </w:tc>
@@ -2846,7 +2846,7 @@
           </w:tcPr>
           <w:p>
             <w:r>
-              <w:t>Mistral-7B-v0.3-Instruct</w:t>
+              <w:t>LLaMA-3.2-3B-Instruct</w:t>
             </w:r>
           </w:p>
         </w:tc>
@@ -2856,7 +2856,7 @@
           </w:tcPr>
           <w:p>
             <w:r>
-              <w:t>7.24B</w:t>
+              <w:t>3.21B</w:t>
             </w:r>
           </w:p>
         </w:tc>
@@ -2866,7 +2866,7 @@
           </w:tcPr>
           <w:p>
             <w:r>
-              <w:t>Mistral</w:t>
+              <w:t>LLaMA-3.2</w:t>
             </w:r>
           </w:p>
         </w:tc>
@@ -2876,7 +2876,7 @@
           </w:tcPr>
           <w:p>
             <w:r>
-              <w:t>Apache-2.0</w:t>
+              <w:t>Llama 3.2 Community</w:t>
             </w:r>
           </w:p>
         </w:tc>
@@ -2906,7 +2906,7 @@
           </w:tcPr>
           <w:p>
             <w:r>
-              <w:t>99.20</w:t>
+              <w:t>99.49</w:t>
             </w:r>
           </w:p>
         </w:tc>
@@ -2936,7 +2936,7 @@
           </w:tcPr>
           <w:p>
             <w:r>
-              <w:t>1158</w:t>
+              <w:t>559</w:t>
             </w:r>
           </w:p>
         </w:tc>
@@ -2946,7 +2946,7 @@
           </w:tcPr>
           <w:p>
             <w:r>
-              <w:t>5.8</w:t>
+              <w:t>3.4</w:t>
             </w:r>
           </w:p>
         </w:tc>
@@ -2958,7 +2958,7 @@
           </w:tcPr>
           <w:p>
             <w:r>
-              <w:t>Qwen2.5-7B-Instruct</w:t>
+              <w:t>Phi-4-mini</w:t>
             </w:r>
           </w:p>
         </w:tc>
@@ -2968,7 +2968,7 @@
           </w:tcPr>
           <w:p>
             <w:r>
-              <w:t>7.62B</w:t>
+              <w:t>3.82B</w:t>
             </w:r>
           </w:p>
         </w:tc>
@@ -2978,7 +2978,7 @@
           </w:tcPr>
           <w:p>
             <w:r>
-              <w:t>Qwen2.5</w:t>
+              <w:t>Phi-4</w:t>
             </w:r>
           </w:p>
         </w:tc>
@@ -2988,7 +2988,7 @@
           </w:tcPr>
           <w:p>
             <w:r>
-              <w:t>Apache-2.0</w:t>
+              <w:t>MIT</w:t>
             </w:r>
           </w:p>
         </w:tc>
@@ -3018,7 +3018,7 @@
           </w:tcPr>
           <w:p>
             <w:r>
-              <w:t>98.94</w:t>
+              <w:t>99.77</w:t>
             </w:r>
           </w:p>
         </w:tc>
@@ -3048,7 +3048,7 @@
           </w:tcPr>
           <w:p>
             <w:r>
-              <w:t>1229</w:t>
+              <w:t>662</w:t>
             </w:r>
           </w:p>
         </w:tc>
@@ -3058,7 +3058,7 @@
           </w:tcPr>
           <w:p>
             <w:r>
-              <w:t>6.1</w:t>
+              <w:t>3.8</w:t>
             </w:r>
           </w:p>
         </w:tc>
@@ -3070,7 +3070,7 @@
           </w:tcPr>
           <w:p>
             <w:r>
-              <w:t>Phi-4-mini</w:t>
+              <w:t>Qwen2.5-7B-Instruct</w:t>
             </w:r>
           </w:p>
         </w:tc>
@@ -3080,7 +3080,7 @@
           </w:tcPr>
           <w:p>
             <w:r>
-              <w:t>3.82B</w:t>
+              <w:t>7.62B</w:t>
             </w:r>
           </w:p>
         </w:tc>
@@ -3090,7 +3090,7 @@
           </w:tcPr>
           <w:p>
             <w:r>
-              <w:t>Phi-4</w:t>
+              <w:t>Qwen2.5</w:t>
             </w:r>
           </w:p>
         </w:tc>
@@ -3100,7 +3100,7 @@
           </w:tcPr>
           <w:p>
             <w:r>
-              <w:t>MIT</w:t>
+              <w:t>Apache-2.0</w:t>
             </w:r>
           </w:p>
         </w:tc>
@@ -3120,7 +3120,7 @@
           </w:tcPr>
           <w:p>
             <w:r>
-              <w:t>99.69</w:t>
+              <w:t>99.95</w:t>
             </w:r>
           </w:p>
         </w:tc>
@@ -3130,7 +3130,7 @@
           </w:tcPr>
           <w:p>
             <w:r>
-              <w:t>99.76</w:t>
+              <w:t>98.90</w:t>
             </w:r>
           </w:p>
         </w:tc>
@@ -3160,7 +3160,7 @@
           </w:tcPr>
           <w:p>
             <w:r>
-              <w:t>642</w:t>
+              <w:t>1238</w:t>
             </w:r>
           </w:p>
         </w:tc>
@@ -3170,7 +3170,7 @@
           </w:tcPr>
           <w:p>
             <w:r>
-              <w:t>3.8</w:t>
+              <w:t>6.1</w:t>
             </w:r>
           </w:p>
         </w:tc>
@@ -3182,7 +3182,7 @@
           </w:tcPr>
           <w:p>
             <w:r>
-              <w:t>Phi-3.5-mini-Instruct</w:t>
+              <w:t>Mistral-7B-v0.3-Instruct</w:t>
             </w:r>
           </w:p>
         </w:tc>
@@ -3192,7 +3192,7 @@
           </w:tcPr>
           <w:p>
             <w:r>
-              <w:t>3.82B</w:t>
+              <w:t>7.24B</w:t>
             </w:r>
           </w:p>
         </w:tc>
@@ -3202,7 +3202,7 @@
           </w:tcPr>
           <w:p>
             <w:r>
-              <w:t>Phi-3.5</w:t>
+              <w:t>Mistral</w:t>
             </w:r>
           </w:p>
         </w:tc>
@@ -3212,7 +3212,7 @@
           </w:tcPr>
           <w:p>
             <w:r>
-              <w:t>MIT</w:t>
+              <w:t>Apache-2.0</w:t>
             </w:r>
           </w:p>
         </w:tc>
@@ -3232,7 +3232,7 @@
           </w:tcPr>
           <w:p>
             <w:r>
-              <w:t>99.28</w:t>
+              <w:t>99.81</w:t>
             </w:r>
           </w:p>
         </w:tc>
@@ -3242,7 +3242,7 @@
           </w:tcPr>
           <w:p>
             <w:r>
-              <w:t>98.99</w:t>
+              <w:t>99.34</w:t>
             </w:r>
           </w:p>
         </w:tc>
@@ -3262,7 +3262,7 @@
           </w:tcPr>
           <w:p>
             <w:r>
-              <w:t>99.56</w:t>
+              <w:t>100.00</w:t>
             </w:r>
           </w:p>
         </w:tc>
@@ -3272,7 +3272,7 @@
           </w:tcPr>
           <w:p>
             <w:r>
-              <w:t>654</w:t>
+              <w:t>1154</w:t>
             </w:r>
           </w:p>
         </w:tc>
@@ -3282,7 +3282,7 @@
           </w:tcPr>
           <w:p>
             <w:r>
-              <w:t>3.8</w:t>
+              <w:t>5.8</w:t>
             </w:r>
           </w:p>
         </w:tc>
@@ -3294,7 +3294,7 @@
           </w:tcPr>
           <w:p>
             <w:r>
-              <w:t>LLaMA-3.2-3B-Instruct</w:t>
+              <w:t>Phi-3.5-mini-Instruct</w:t>
             </w:r>
           </w:p>
         </w:tc>
@@ -3304,7 +3304,7 @@
           </w:tcPr>
           <w:p>
             <w:r>
-              <w:t>3.21B</w:t>
+              <w:t>3.82B</w:t>
             </w:r>
           </w:p>
         </w:tc>
@@ -3314,7 +3314,7 @@
           </w:tcPr>
           <w:p>
             <w:r>
-              <w:t>LLaMA-3.2</w:t>
+              <w:t>Phi-3.5</w:t>
             </w:r>
           </w:p>
         </w:tc>
@@ -3324,7 +3324,7 @@
           </w:tcPr>
           <w:p>
             <w:r>
-              <w:t>Llama 3.2 Community</w:t>
+              <w:t>MIT</w:t>
             </w:r>
           </w:p>
         </w:tc>
@@ -3344,7 +3344,7 @@
           </w:tcPr>
           <w:p>
             <w:r>
-              <w:t>99.21</w:t>
+              <w:t>99.35</w:t>
             </w:r>
           </w:p>
         </w:tc>
@@ -3354,7 +3354,7 @@
           </w:tcPr>
           <w:p>
             <w:r>
-              <w:t>99.13</w:t>
+              <w:t>99.36</w:t>
             </w:r>
           </w:p>
         </w:tc>
@@ -3374,7 +3374,7 @@
           </w:tcPr>
           <w:p>
             <w:r>
-              <w:t>99.58</w:t>
+              <w:t>99.74</w:t>
             </w:r>
           </w:p>
         </w:tc>
@@ -3384,7 +3384,7 @@
           </w:tcPr>
           <w:p>
             <w:r>
-              <w:t>552</w:t>
+              <w:t>673</w:t>
             </w:r>
           </w:p>
         </w:tc>
@@ -3394,7 +3394,7 @@
           </w:tcPr>
           <w:p>
             <w:r>
-              <w:t>3.4</w:t>
+              <w:t>3.8</w:t>
             </w:r>
           </w:p>
         </w:tc>
@@ -3456,7 +3456,7 @@
           </w:tcPr>
           <w:p>
             <w:r>
-              <w:t>97.79</w:t>
+              <w:t>97.78</w:t>
             </w:r>
           </w:p>
         </w:tc>
@@ -3466,7 +3466,7 @@
           </w:tcPr>
           <w:p>
             <w:r>
-              <w:t>99.35</w:t>
+              <w:t>99.87</w:t>
             </w:r>
           </w:p>
         </w:tc>
@@ -3476,7 +3476,7 @@
           </w:tcPr>
           <w:p>
             <w:r>
-              <w:t>99.05</w:t>
+              <w:t>99.02</w:t>
             </w:r>
           </w:p>
         </w:tc>
@@ -3486,7 +3486,7 @@
           </w:tcPr>
           <w:p>
             <w:r>
-              <w:t>98.10</w:t>
+              <w:t>98.13</w:t>
             </w:r>
           </w:p>
         </w:tc>
@@ -3496,7 +3496,7 @@
           </w:tcPr>
           <w:p>
             <w:r>
-              <w:t>316</w:t>
+              <w:t>302</w:t>
             </w:r>
           </w:p>
         </w:tc>
@@ -3568,7 +3568,7 @@
           </w:tcPr>
           <w:p>
             <w:r>
-              <w:t>97.05</w:t>
+              <w:t>97.41</w:t>
             </w:r>
           </w:p>
         </w:tc>
@@ -3578,7 +3578,7 @@
           </w:tcPr>
           <w:p>
             <w:r>
-              <w:t>96.60</w:t>
+              <w:t>96.33</w:t>
             </w:r>
           </w:p>
         </w:tc>
@@ -3588,7 +3588,7 @@
           </w:tcPr>
           <w:p>
             <w:r>
-              <w:t>98.53</w:t>
+              <w:t>99.04</w:t>
             </w:r>
           </w:p>
         </w:tc>
@@ -3598,7 +3598,7 @@
           </w:tcPr>
           <w:p>
             <w:r>
-              <w:t>97.37</w:t>
+              <w:t>97.93</w:t>
             </w:r>
           </w:p>
         </w:tc>
@@ -3608,7 +3608,7 @@
           </w:tcPr>
           <w:p>
             <w:r>
-              <w:t>263</w:t>
+              <w:t>265</w:t>
             </w:r>
           </w:p>
         </w:tc>
@@ -3680,7 +3680,7 @@
           </w:tcPr>
           <w:p>
             <w:r>
-              <w:t>92.67</w:t>
+              <w:t>92.14</w:t>
             </w:r>
           </w:p>
         </w:tc>
@@ -3690,7 +3690,7 @@
           </w:tcPr>
           <w:p>
             <w:r>
-              <w:t>91.52</w:t>
+              <w:t>91.47</w:t>
             </w:r>
           </w:p>
         </w:tc>
@@ -3700,7 +3700,7 @@
           </w:tcPr>
           <w:p>
             <w:r>
-              <w:t>93.99</w:t>
+              <w:t>93.34</w:t>
             </w:r>
           </w:p>
         </w:tc>
@@ -3710,7 +3710,7 @@
           </w:tcPr>
           <w:p>
             <w:r>
-              <w:t>93.00</w:t>
+              <w:t>92.53</w:t>
             </w:r>
           </w:p>
         </w:tc>
@@ -3720,7 +3720,7 @@
           </w:tcPr>
           <w:p>
             <w:r>
-              <w:t>154</w:t>
+              <w:t>170</w:t>
             </w:r>
           </w:p>
         </w:tc>
@@ -3792,7 +3792,7 @@
           </w:tcPr>
           <w:p>
             <w:r>
-              <w:t>87.71</w:t>
+              <w:t>87.56</w:t>
             </w:r>
           </w:p>
         </w:tc>
@@ -3802,7 +3802,7 @@
           </w:tcPr>
           <w:p>
             <w:r>
-              <w:t>91.24</w:t>
+              <w:t>91.84</w:t>
             </w:r>
           </w:p>
         </w:tc>
@@ -3812,7 +3812,7 @@
           </w:tcPr>
           <w:p>
             <w:r>
-              <w:t>89.29</w:t>
+              <w:t>88.89</w:t>
             </w:r>
           </w:p>
         </w:tc>
@@ -3822,7 +3822,7 @@
           </w:tcPr>
           <w:p>
             <w:r>
-              <w:t>88.26</w:t>
+              <w:t>88.01</w:t>
             </w:r>
           </w:p>
         </w:tc>
@@ -3832,7 +3832,7 @@
           </w:tcPr>
           <w:p>
             <w:r>
-              <w:t>150</w:t>
+              <w:t>127</w:t>
             </w:r>
           </w:p>
         </w:tc>
@@ -3904,7 +3904,7 @@
           </w:tcPr>
           <w:p>
             <w:r>
-              <w:t>95.80</w:t>
+              <w:t>96.57</w:t>
             </w:r>
           </w:p>
         </w:tc>
@@ -3914,7 +3914,7 @@
           </w:tcPr>
           <w:p>
             <w:r>
-              <w:t>99.27</w:t>
+              <w:t>99.23</w:t>
             </w:r>
           </w:p>
         </w:tc>
@@ -3924,7 +3924,7 @@
           </w:tcPr>
           <w:p>
             <w:r>
-              <w:t>97.26</w:t>
+              <w:t>98.18</w:t>
             </w:r>
           </w:p>
         </w:tc>
@@ -3934,7 +3934,7 @@
           </w:tcPr>
           <w:p>
             <w:r>
-              <w:t>96.28</w:t>
+              <w:t>96.93</w:t>
             </w:r>
           </w:p>
         </w:tc>
@@ -3944,7 +3944,7 @@
           </w:tcPr>
           <w:p>
             <w:r>
-              <w:t>10472</w:t>
+              <w:t>10476</w:t>
             </w:r>
           </w:p>
         </w:tc>
@@ -4016,7 +4016,7 @@
           </w:tcPr>
           <w:p>
             <w:r>
-              <w:t>91.70</w:t>
+              <w:t>91.41</w:t>
             </w:r>
           </w:p>
         </w:tc>
@@ -4026,7 +4026,7 @@
           </w:tcPr>
           <w:p>
             <w:r>
-              <w:t>99.05</w:t>
+              <w:t>99.42</w:t>
             </w:r>
           </w:p>
         </w:tc>
@@ -4036,7 +4036,7 @@
           </w:tcPr>
           <w:p>
             <w:r>
-              <w:t>93.49</w:t>
+              <w:t>93.00</w:t>
             </w:r>
           </w:p>
         </w:tc>
@@ -4046,7 +4046,7 @@
           </w:tcPr>
           <w:p>
             <w:r>
-              <w:t>92.01</w:t>
+              <w:t>91.78</w:t>
             </w:r>
           </w:p>
         </w:tc>
@@ -4056,7 +4056,7 @@
           </w:tcPr>
           <w:p>
             <w:r>
-              <w:t>2152</w:t>
+              <w:t>2158</w:t>
             </w:r>
           </w:p>
         </w:tc>
@@ -4128,7 +4128,7 @@
           </w:tcPr>
           <w:p>
             <w:r>
-              <w:t>97.95</w:t>
+              <w:t>98.11</w:t>
             </w:r>
           </w:p>
         </w:tc>
@@ -4138,7 +4138,7 @@
           </w:tcPr>
           <w:p>
             <w:r>
-              <w:t>99.74</w:t>
+              <w:t>98.94</w:t>
             </w:r>
           </w:p>
         </w:tc>
@@ -4148,7 +4148,7 @@
           </w:tcPr>
           <w:p>
             <w:r>
-              <w:t>99.72</w:t>
+              <w:t>99.37</w:t>
             </w:r>
           </w:p>
         </w:tc>
@@ -4158,7 +4158,7 @@
           </w:tcPr>
           <w:p>
             <w:r>
-              <w:t>98.37</w:t>
+              <w:t>98.46</w:t>
             </w:r>
           </w:p>
         </w:tc>
@@ -4168,7 +4168,7 @@
           </w:tcPr>
           <w:p>
             <w:r>
-              <w:t>60180</w:t>
+              <w:t>60172</w:t>
             </w:r>
           </w:p>
         </w:tc>
@@ -4190,7 +4190,7 @@
           </w:tcPr>
           <w:p>
             <w:r>
-              <w:t>Command-R+</w:t>
+              <w:t>Qwen2.5-72B-Instruct</w:t>
             </w:r>
           </w:p>
         </w:tc>
@@ -4200,7 +4200,7 @@
           </w:tcPr>
           <w:p>
             <w:r>
-              <w:t>104B</w:t>
+              <w:t>72B</w:t>
             </w:r>
           </w:p>
         </w:tc>
@@ -4210,7 +4210,7 @@
           </w:tcPr>
           <w:p>
             <w:r>
-              <w:t>Command-R</w:t>
+              <w:t>Qwen2.5</w:t>
             </w:r>
           </w:p>
         </w:tc>
@@ -4220,7 +4220,7 @@
           </w:tcPr>
           <w:p>
             <w:r>
-              <w:t>CC-BY-NC-4.0</w:t>
+              <w:t>Apache-2.0</w:t>
             </w:r>
           </w:p>
         </w:tc>
@@ -4240,7 +4240,7 @@
           </w:tcPr>
           <w:p>
             <w:r>
-              <w:t>97.06</w:t>
+              <w:t>96.16</w:t>
             </w:r>
           </w:p>
         </w:tc>
@@ -4250,7 +4250,7 @@
           </w:tcPr>
           <w:p>
             <w:r>
-              <w:t>99.44</w:t>
+              <w:t>99.65</w:t>
             </w:r>
           </w:p>
         </w:tc>
@@ -4260,7 +4260,7 @@
           </w:tcPr>
           <w:p>
             <w:r>
-              <w:t>98.31</w:t>
+              <w:t>97.45</w:t>
             </w:r>
           </w:p>
         </w:tc>
@@ -4270,7 +4270,7 @@
           </w:tcPr>
           <w:p>
             <w:r>
-              <w:t>97.49</w:t>
+              <w:t>96.73</w:t>
             </w:r>
           </w:p>
         </w:tc>
@@ -4280,7 +4280,7 @@
           </w:tcPr>
           <w:p>
             <w:r>
-              <w:t>15516</w:t>
+              <w:t>10773</w:t>
             </w:r>
           </w:p>
         </w:tc>
@@ -4290,7 +4290,7 @@
           </w:tcPr>
           <w:p>
             <w:r>
-              <w:t>63.9</w:t>
+              <w:t>44.7</w:t>
             </w:r>
           </w:p>
         </w:tc>
@@ -4302,7 +4302,7 @@
           </w:tcPr>
           <w:p>
             <w:r>
-              <w:t>Qwen2.5-72B-Instruct</w:t>
+              <w:t>Command-R+</w:t>
             </w:r>
           </w:p>
         </w:tc>
@@ -4312,7 +4312,7 @@
           </w:tcPr>
           <w:p>
             <w:r>
-              <w:t>72B</w:t>
+              <w:t>104B</w:t>
             </w:r>
           </w:p>
         </w:tc>
@@ -4322,7 +4322,7 @@
           </w:tcPr>
           <w:p>
             <w:r>
-              <w:t>Qwen2.5</w:t>
+              <w:t>Command-R</w:t>
             </w:r>
           </w:p>
         </w:tc>
@@ -4332,7 +4332,7 @@
           </w:tcPr>
           <w:p>
             <w:r>
-              <w:t>Apache-2.0</w:t>
+              <w:t>CC-BY-NC-4.0</w:t>
             </w:r>
           </w:p>
         </w:tc>
@@ -4352,7 +4352,7 @@
           </w:tcPr>
           <w:p>
             <w:r>
-              <w:t>96.47</w:t>
+              <w:t>96.01</w:t>
             </w:r>
           </w:p>
         </w:tc>
@@ -4362,7 +4362,7 @@
           </w:tcPr>
           <w:p>
             <w:r>
-              <w:t>99.16</w:t>
+              <w:t>99.35</w:t>
             </w:r>
           </w:p>
         </w:tc>
@@ -4372,7 +4372,7 @@
           </w:tcPr>
           <w:p>
             <w:r>
-              <w:t>97.90</w:t>
+              <w:t>97.65</w:t>
             </w:r>
           </w:p>
         </w:tc>
@@ -4382,7 +4382,7 @@
           </w:tcPr>
           <w:p>
             <w:r>
-              <w:t>97.00</w:t>
+              <w:t>96.42</w:t>
             </w:r>
           </w:p>
         </w:tc>
@@ -4392,7 +4392,7 @@
           </w:tcPr>
           <w:p>
             <w:r>
-              <w:t>10760</w:t>
+              <w:t>15502</w:t>
             </w:r>
           </w:p>
         </w:tc>
@@ -4402,7 +4402,7 @@
           </w:tcPr>
           <w:p>
             <w:r>
-              <w:t>44.7</w:t>
+              <w:t>63.9</w:t>
             </w:r>
           </w:p>
         </w:tc>
@@ -4464,7 +4464,7 @@
           </w:tcPr>
           <w:p>
             <w:r>
-              <w:t>96.13</w:t>
+              <w:t>95.90</w:t>
             </w:r>
           </w:p>
         </w:tc>
@@ -4474,7 +4474,7 @@
           </w:tcPr>
           <w:p>
             <w:r>
-              <w:t>99.34</w:t>
+              <w:t>99.44</w:t>
             </w:r>
           </w:p>
         </w:tc>
@@ -4484,7 +4484,7 @@
           </w:tcPr>
           <w:p>
             <w:r>
-              <w:t>97.49</w:t>
+              <w:t>97.36</w:t>
             </w:r>
           </w:p>
         </w:tc>
@@ -4494,7 +4494,7 @@
           </w:tcPr>
           <w:p>
             <w:r>
-              <w:t>96.55</w:t>
+              <w:t>96.16</w:t>
             </w:r>
           </w:p>
         </w:tc>
@@ -4576,7 +4576,7 @@
           </w:tcPr>
           <w:p>
             <w:r>
-              <w:t>95.66</w:t>
+              <w:t>95.63</w:t>
             </w:r>
           </w:p>
         </w:tc>
@@ -4586,7 +4586,7 @@
           </w:tcPr>
           <w:p>
             <w:r>
-              <w:t>99.90</w:t>
+              <w:t>99.83</w:t>
             </w:r>
           </w:p>
         </w:tc>
@@ -4596,7 +4596,7 @@
           </w:tcPr>
           <w:p>
             <w:r>
-              <w:t>97.11</w:t>
+              <w:t>96.90</w:t>
             </w:r>
           </w:p>
         </w:tc>
@@ -4606,7 +4606,7 @@
           </w:tcPr>
           <w:p>
             <w:r>
-              <w:t>95.90</w:t>
+              <w:t>96.02</w:t>
             </w:r>
           </w:p>
         </w:tc>
@@ -4616,7 +4616,7 @@
           </w:tcPr>
           <w:p>
             <w:r>
-              <w:t>1461</w:t>
+              <w:t>1440</w:t>
             </w:r>
           </w:p>
         </w:tc>
@@ -4638,7 +4638,7 @@
           </w:tcPr>
           <w:p>
             <w:r>
-              <w:t>DBRX</w:t>
+              <w:t>Falcon-180B</w:t>
             </w:r>
           </w:p>
         </w:tc>
@@ -4648,7 +4648,7 @@
           </w:tcPr>
           <w:p>
             <w:r>
-              <w:t>132B</w:t>
+              <w:t>180B</w:t>
             </w:r>
           </w:p>
         </w:tc>
@@ -4658,7 +4658,7 @@
           </w:tcPr>
           <w:p>
             <w:r>
-              <w:t>DBRX</w:t>
+              <w:t>Falcon</w:t>
             </w:r>
           </w:p>
         </w:tc>
@@ -4668,7 +4668,7 @@
           </w:tcPr>
           <w:p>
             <w:r>
-              <w:t>Open</w:t>
+              <w:t>Apache-2.0</w:t>
             </w:r>
           </w:p>
         </w:tc>
@@ -4688,7 +4688,7 @@
           </w:tcPr>
           <w:p>
             <w:r>
-              <w:t>95.15</w:t>
+              <w:t>95.19</w:t>
             </w:r>
           </w:p>
         </w:tc>
@@ -4698,7 +4698,7 @@
           </w:tcPr>
           <w:p>
             <w:r>
-              <w:t>99.36</w:t>
+              <w:t>99.46</w:t>
             </w:r>
           </w:p>
         </w:tc>
@@ -4708,7 +4708,7 @@
           </w:tcPr>
           <w:p>
             <w:r>
-              <w:t>96.50</w:t>
+              <w:t>96.40</w:t>
             </w:r>
           </w:p>
         </w:tc>
@@ -4718,7 +4718,7 @@
           </w:tcPr>
           <w:p>
             <w:r>
-              <w:t>95.40</w:t>
+              <w:t>95.41</w:t>
             </w:r>
           </w:p>
         </w:tc>
@@ -4728,7 +4728,7 @@
           </w:tcPr>
           <w:p>
             <w:r>
-              <w:t>1359</w:t>
+              <w:t>26795</w:t>
             </w:r>
           </w:p>
         </w:tc>
@@ -4738,7 +4738,7 @@
           </w:tcPr>
           <w:p>
             <w:r>
-              <w:t>74.1</w:t>
+              <w:t>109.5</w:t>
             </w:r>
           </w:p>
         </w:tc>
@@ -4750,7 +4750,7 @@
           </w:tcPr>
           <w:p>
             <w:r>
-              <w:t>Falcon-180B</w:t>
+              <w:t>Command-R</w:t>
             </w:r>
           </w:p>
         </w:tc>
@@ -4760,7 +4760,7 @@
           </w:tcPr>
           <w:p>
             <w:r>
-              <w:t>180B</w:t>
+              <w:t>35B</w:t>
             </w:r>
           </w:p>
         </w:tc>
@@ -4770,7 +4770,7 @@
           </w:tcPr>
           <w:p>
             <w:r>
-              <w:t>Falcon</w:t>
+              <w:t>Command-R</w:t>
             </w:r>
           </w:p>
         </w:tc>
@@ -4780,7 +4780,7 @@
           </w:tcPr>
           <w:p>
             <w:r>
-              <w:t>Apache-2.0</w:t>
+              <w:t>CC-BY-NC-4.0</w:t>
             </w:r>
           </w:p>
         </w:tc>
@@ -4800,7 +4800,7 @@
           </w:tcPr>
           <w:p>
             <w:r>
-              <w:t>94.87</w:t>
+              <w:t>94.59</w:t>
             </w:r>
           </w:p>
         </w:tc>
@@ -4810,7 +4810,7 @@
           </w:tcPr>
           <w:p>
             <w:r>
-              <w:t>99.49</w:t>
+              <w:t>98.89</w:t>
             </w:r>
           </w:p>
         </w:tc>
@@ -4820,7 +4820,7 @@
           </w:tcPr>
           <w:p>
             <w:r>
-              <w:t>96.26</w:t>
+              <w:t>96.37</w:t>
             </w:r>
           </w:p>
         </w:tc>
@@ -4840,7 +4840,7 @@
           </w:tcPr>
           <w:p>
             <w:r>
-              <w:t>26773</w:t>
+              <w:t>5277</w:t>
             </w:r>
           </w:p>
         </w:tc>
@@ -4850,7 +4850,7 @@
           </w:tcPr>
           <w:p>
             <w:r>
-              <w:t>109.5</w:t>
+              <w:t>22.5</w:t>
             </w:r>
           </w:p>
         </w:tc>
@@ -4862,7 +4862,7 @@
           </w:tcPr>
           <w:p>
             <w:r>
-              <w:t>Qwen2.5-32B-Instruct</w:t>
+              <w:t>DBRX</w:t>
             </w:r>
           </w:p>
         </w:tc>
@@ -4872,7 +4872,7 @@
           </w:tcPr>
           <w:p>
             <w:r>
-              <w:t>32B</w:t>
+              <w:t>132B</w:t>
             </w:r>
           </w:p>
         </w:tc>
@@ -4882,7 +4882,7 @@
           </w:tcPr>
           <w:p>
             <w:r>
-              <w:t>Qwen2.5</w:t>
+              <w:t>DBRX</w:t>
             </w:r>
           </w:p>
         </w:tc>
@@ -4892,7 +4892,7 @@
           </w:tcPr>
           <w:p>
             <w:r>
-              <w:t>Apache-2.0</w:t>
+              <w:t>Open</w:t>
             </w:r>
           </w:p>
         </w:tc>
@@ -4912,7 +4912,7 @@
           </w:tcPr>
           <w:p>
             <w:r>
-              <w:t>94.40</w:t>
+              <w:t>94.59</w:t>
             </w:r>
           </w:p>
         </w:tc>
@@ -4922,7 +4922,7 @@
           </w:tcPr>
           <w:p>
             <w:r>
-              <w:t>99.68</w:t>
+              <w:t>99.83</w:t>
             </w:r>
           </w:p>
         </w:tc>
@@ -4932,7 +4932,7 @@
           </w:tcPr>
           <w:p>
             <w:r>
-              <w:t>96.16</w:t>
+              <w:t>96.28</w:t>
             </w:r>
           </w:p>
         </w:tc>
@@ -4942,7 +4942,7 @@
           </w:tcPr>
           <w:p>
             <w:r>
-              <w:t>94.82</w:t>
+              <w:t>94.97</w:t>
             </w:r>
           </w:p>
         </w:tc>
@@ -4952,7 +4952,7 @@
           </w:tcPr>
           <w:p>
             <w:r>
-              <w:t>4820</w:t>
+              <w:t>1361</w:t>
             </w:r>
           </w:p>
         </w:tc>
@@ -4962,7 +4962,7 @@
           </w:tcPr>
           <w:p>
             <w:r>
-              <w:t>20.7</w:t>
+              <w:t>74.1</w:t>
             </w:r>
           </w:p>
         </w:tc>
@@ -4974,7 +4974,7 @@
           </w:tcPr>
           <w:p>
             <w:r>
-              <w:t>Command-R</w:t>
+              <w:t>Qwen2.5-32B-Instruct</w:t>
             </w:r>
           </w:p>
         </w:tc>
@@ -4984,7 +4984,7 @@
           </w:tcPr>
           <w:p>
             <w:r>
-              <w:t>35B</w:t>
+              <w:t>32B</w:t>
             </w:r>
           </w:p>
         </w:tc>
@@ -4994,7 +4994,7 @@
           </w:tcPr>
           <w:p>
             <w:r>
-              <w:t>Command-R</w:t>
+              <w:t>Qwen2.5</w:t>
             </w:r>
           </w:p>
         </w:tc>
@@ -5004,7 +5004,7 @@
           </w:tcPr>
           <w:p>
             <w:r>
-              <w:t>CC-BY-NC-4.0</w:t>
+              <w:t>Apache-2.0</w:t>
             </w:r>
           </w:p>
         </w:tc>
@@ -5024,7 +5024,7 @@
           </w:tcPr>
           <w:p>
             <w:r>
-              <w:t>94.30</w:t>
+              <w:t>94.07</w:t>
             </w:r>
           </w:p>
         </w:tc>
@@ -5034,7 +5034,7 @@
           </w:tcPr>
           <w:p>
             <w:r>
-              <w:t>99.23</w:t>
+              <w:t>99.60</w:t>
             </w:r>
           </w:p>
         </w:tc>
@@ -5044,7 +5044,7 @@
           </w:tcPr>
           <w:p>
             <w:r>
-              <w:t>96.01</w:t>
+              <w:t>95.56</w:t>
             </w:r>
           </w:p>
         </w:tc>
@@ -5054,7 +5054,7 @@
           </w:tcPr>
           <w:p>
             <w:r>
-              <w:t>94.77</w:t>
+              <w:t>94.47</w:t>
             </w:r>
           </w:p>
         </w:tc>
@@ -5064,7 +5064,7 @@
           </w:tcPr>
           <w:p>
             <w:r>
-              <w:t>5290</w:t>
+              <w:t>4845</w:t>
             </w:r>
           </w:p>
         </w:tc>
@@ -5074,7 +5074,7 @@
           </w:tcPr>
           <w:p>
             <w:r>
-              <w:t>22.5</w:t>
+              <w:t>20.7</w:t>
             </w:r>
           </w:p>
         </w:tc>
@@ -5136,7 +5136,7 @@
           </w:tcPr>
           <w:p>
             <w:r>
-              <w:t>93.65</w:t>
+              <w:t>94.05</w:t>
             </w:r>
           </w:p>
         </w:tc>
@@ -5146,7 +5146,7 @@
           </w:tcPr>
           <w:p>
             <w:r>
-              <w:t>99.88</w:t>
+              <w:t>99.57</w:t>
             </w:r>
           </w:p>
         </w:tc>
@@ -5156,7 +5156,7 @@
           </w:tcPr>
           <w:p>
             <w:r>
-              <w:t>94.93</w:t>
+              <w:t>95.39</w:t>
             </w:r>
           </w:p>
         </w:tc>
@@ -5166,7 +5166,7 @@
           </w:tcPr>
           <w:p>
             <w:r>
-              <w:t>93.89</w:t>
+              <w:t>94.48</w:t>
             </w:r>
           </w:p>
         </w:tc>
@@ -5176,7 +5176,7 @@
           </w:tcPr>
           <w:p>
             <w:r>
-              <w:t>5149</w:t>
+              <w:t>5137</w:t>
             </w:r>
           </w:p>
         </w:tc>
@@ -5248,7 +5248,7 @@
           </w:tcPr>
           <w:p>
             <w:r>
-              <w:t>93.15</w:t>
+              <w:t>93.70</w:t>
             </w:r>
           </w:p>
         </w:tc>
@@ -5258,7 +5258,7 @@
           </w:tcPr>
           <w:p>
             <w:r>
-              <w:t>98.93</w:t>
+              <w:t>98.98</w:t>
             </w:r>
           </w:p>
         </w:tc>
@@ -5268,7 +5268,7 @@
           </w:tcPr>
           <w:p>
             <w:r>
-              <w:t>94.61</w:t>
+              <w:t>95.10</w:t>
             </w:r>
           </w:p>
         </w:tc>
@@ -5278,7 +5278,7 @@
           </w:tcPr>
           <w:p>
             <w:r>
-              <w:t>93.73</w:t>
+              <w:t>94.02</w:t>
             </w:r>
           </w:p>
         </w:tc>
@@ -5288,7 +5288,7 @@
           </w:tcPr>
           <w:p>
             <w:r>
-              <w:t>516</w:t>
+              <w:t>513</w:t>
             </w:r>
           </w:p>
         </w:tc>
@@ -5360,7 +5360,7 @@
           </w:tcPr>
           <w:p>
             <w:r>
-              <w:t>92.73</w:t>
+              <w:t>93.18</w:t>
             </w:r>
           </w:p>
         </w:tc>
@@ -5370,7 +5370,7 @@
           </w:tcPr>
           <w:p>
             <w:r>
-              <w:t>98.93</w:t>
+              <w:t>99.44</w:t>
             </w:r>
           </w:p>
         </w:tc>
@@ -5380,7 +5380,7 @@
           </w:tcPr>
           <w:p>
             <w:r>
-              <w:t>94.05</w:t>
+              <w:t>94.43</w:t>
             </w:r>
           </w:p>
         </w:tc>
@@ -5390,7 +5390,7 @@
           </w:tcPr>
           <w:p>
             <w:r>
-              <w:t>93.06</w:t>
+              <w:t>93.48</w:t>
             </w:r>
           </w:p>
         </w:tc>
@@ -5400,7 +5400,7 @@
           </w:tcPr>
           <w:p>
             <w:r>
-              <w:t>3337</w:t>
+              <w:t>3346</w:t>
             </w:r>
           </w:p>
         </w:tc>
@@ -5422,7 +5422,7 @@
           </w:tcPr>
           <w:p>
             <w:r>
-              <w:t>CodeStral</w:t>
+              <w:t>Falcon-40B</w:t>
             </w:r>
           </w:p>
         </w:tc>
@@ -5432,7 +5432,7 @@
           </w:tcPr>
           <w:p>
             <w:r>
-              <w:t>22B</w:t>
+              <w:t>40B</w:t>
             </w:r>
           </w:p>
         </w:tc>
@@ -5442,7 +5442,7 @@
           </w:tcPr>
           <w:p>
             <w:r>
-              <w:t>CodeStral</w:t>
+              <w:t>Falcon</w:t>
             </w:r>
           </w:p>
         </w:tc>
@@ -5452,7 +5452,7 @@
           </w:tcPr>
           <w:p>
             <w:r>
-              <w:t>MNPL</w:t>
+              <w:t>Apache-2.0</w:t>
             </w:r>
           </w:p>
         </w:tc>
@@ -5472,7 +5472,7 @@
           </w:tcPr>
           <w:p>
             <w:r>
-              <w:t>92.30</w:t>
+              <w:t>93.15</w:t>
             </w:r>
           </w:p>
         </w:tc>
@@ -5482,7 +5482,7 @@
           </w:tcPr>
           <w:p>
             <w:r>
-              <w:t>99.18</w:t>
+              <w:t>99.24</w:t>
             </w:r>
           </w:p>
         </w:tc>
@@ -5492,7 +5492,7 @@
           </w:tcPr>
           <w:p>
             <w:r>
-              <w:t>93.73</w:t>
+              <w:t>94.69</w:t>
             </w:r>
           </w:p>
         </w:tc>
@@ -5502,7 +5502,7 @@
           </w:tcPr>
           <w:p>
             <w:r>
-              <w:t>92.66</w:t>
+              <w:t>93.36</w:t>
             </w:r>
           </w:p>
         </w:tc>
@@ -5512,7 +5512,7 @@
           </w:tcPr>
           <w:p>
             <w:r>
-              <w:t>3349</w:t>
+              <w:t>6008</w:t>
             </w:r>
           </w:p>
         </w:tc>
@@ -5522,7 +5522,7 @@
           </w:tcPr>
           <w:p>
             <w:r>
-              <w:t>14.7</w:t>
+              <w:t>25.5</w:t>
             </w:r>
           </w:p>
         </w:tc>
@@ -5534,7 +5534,7 @@
           </w:tcPr>
           <w:p>
             <w:r>
-              <w:t>Falcon-40B</w:t>
+              <w:t>CodeStral</w:t>
             </w:r>
           </w:p>
         </w:tc>
@@ -5544,7 +5544,7 @@
           </w:tcPr>
           <w:p>
             <w:r>
-              <w:t>40B</w:t>
+              <w:t>22B</w:t>
             </w:r>
           </w:p>
         </w:tc>
@@ -5554,7 +5554,7 @@
           </w:tcPr>
           <w:p>
             <w:r>
-              <w:t>Falcon</w:t>
+              <w:t>CodeStral</w:t>
             </w:r>
           </w:p>
         </w:tc>
@@ -5564,7 +5564,7 @@
           </w:tcPr>
           <w:p>
             <w:r>
-              <w:t>Apache-2.0</w:t>
+              <w:t>MNPL</w:t>
             </w:r>
           </w:p>
         </w:tc>
@@ -5584,7 +5584,7 @@
           </w:tcPr>
           <w:p>
             <w:r>
-              <w:t>92.25</w:t>
+              <w:t>92.27</w:t>
             </w:r>
           </w:p>
         </w:tc>
@@ -5594,7 +5594,7 @@
           </w:tcPr>
           <w:p>
             <w:r>
-              <w:t>99.32</w:t>
+              <w:t>99.82</w:t>
             </w:r>
           </w:p>
         </w:tc>
@@ -5604,7 +5604,7 @@
           </w:tcPr>
           <w:p>
             <w:r>
-              <w:t>93.99</w:t>
+              <w:t>93.97</w:t>
             </w:r>
           </w:p>
         </w:tc>
@@ -5614,7 +5614,7 @@
           </w:tcPr>
           <w:p>
             <w:r>
-              <w:t>92.46</w:t>
+              <w:t>92.69</w:t>
             </w:r>
           </w:p>
         </w:tc>
@@ -5624,7 +5624,7 @@
           </w:tcPr>
           <w:p>
             <w:r>
-              <w:t>6006</w:t>
+              <w:t>3339</w:t>
             </w:r>
           </w:p>
         </w:tc>
@@ -5634,7 +5634,7 @@
           </w:tcPr>
           <w:p>
             <w:r>
-              <w:t>25.5</w:t>
+              <w:t>14.7</w:t>
             </w:r>
           </w:p>
         </w:tc>
@@ -5646,7 +5646,7 @@
           </w:tcPr>
           <w:p>
             <w:r>
-              <w:t>Phi-4</w:t>
+              <w:t>Phi-3-medium-Instruct</w:t>
             </w:r>
           </w:p>
         </w:tc>
@@ -5666,7 +5666,7 @@
           </w:tcPr>
           <w:p>
             <w:r>
-              <w:t>Phi-4</w:t>
+              <w:t>Phi-3</w:t>
             </w:r>
           </w:p>
         </w:tc>
@@ -5696,7 +5696,7 @@
           </w:tcPr>
           <w:p>
             <w:r>
-              <w:t>91.63</w:t>
+              <w:t>91.26</w:t>
             </w:r>
           </w:p>
         </w:tc>
@@ -5706,7 +5706,7 @@
           </w:tcPr>
           <w:p>
             <w:r>
-              <w:t>99.56</w:t>
+              <w:t>99.77</w:t>
             </w:r>
           </w:p>
         </w:tc>
@@ -5716,7 +5716,7 @@
           </w:tcPr>
           <w:p>
             <w:r>
-              <w:t>92.88</w:t>
+              <w:t>92.53</w:t>
             </w:r>
           </w:p>
         </w:tc>
@@ -5726,7 +5726,7 @@
           </w:tcPr>
           <w:p>
             <w:r>
-              <w:t>91.96</w:t>
+              <w:t>91.68</w:t>
             </w:r>
           </w:p>
         </w:tc>
@@ -5736,7 +5736,7 @@
           </w:tcPr>
           <w:p>
             <w:r>
-              <w:t>2158</w:t>
+              <w:t>2167</w:t>
             </w:r>
           </w:p>
         </w:tc>
@@ -5758,7 +5758,7 @@
           </w:tcPr>
           <w:p>
             <w:r>
-              <w:t>Phi-3-medium-Instruct</w:t>
+              <w:t>Phi-4</w:t>
             </w:r>
           </w:p>
         </w:tc>
@@ -5778,7 +5778,7 @@
           </w:tcPr>
           <w:p>
             <w:r>
-              <w:t>Phi-3</w:t>
+              <w:t>Phi-4</w:t>
             </w:r>
           </w:p>
         </w:tc>
@@ -5808,7 +5808,7 @@
           </w:tcPr>
           <w:p>
             <w:r>
-              <w:t>90.76</w:t>
+              <w:t>91.25</w:t>
             </w:r>
           </w:p>
         </w:tc>
@@ -5818,7 +5818,7 @@
           </w:tcPr>
           <w:p>
             <w:r>
-              <w:t>99.68</w:t>
+              <w:t>98.86</w:t>
             </w:r>
           </w:p>
         </w:tc>
@@ -5828,7 +5828,7 @@
           </w:tcPr>
           <w:p>
             <w:r>
-              <w:t>92.21</w:t>
+              <w:t>92.75</w:t>
             </w:r>
           </w:p>
         </w:tc>
@@ -5838,7 +5838,7 @@
           </w:tcPr>
           <w:p>
             <w:r>
-              <w:t>91.03</w:t>
+              <w:t>91.63</w:t>
             </w:r>
           </w:p>
         </w:tc>
@@ -5848,7 +5848,7 @@
           </w:tcPr>
           <w:p>
             <w:r>
-              <w:t>2167</w:t>
+              <w:t>2151</w:t>
             </w:r>
           </w:p>
         </w:tc>
@@ -5920,7 +5920,7 @@
           </w:tcPr>
           <w:p>
             <w:r>
-              <w:t>89.52</w:t>
+              <w:t>89.28</w:t>
             </w:r>
           </w:p>
         </w:tc>
@@ -5930,7 +5930,7 @@
           </w:tcPr>
           <w:p>
             <w:r>
-              <w:t>99.69</w:t>
+              <w:t>98.84</w:t>
             </w:r>
           </w:p>
         </w:tc>
@@ -5940,7 +5940,7 @@
           </w:tcPr>
           <w:p>
             <w:r>
-              <w:t>90.95</w:t>
+              <w:t>90.81</w:t>
             </w:r>
           </w:p>
         </w:tc>
@@ -5950,7 +5950,7 @@
           </w:tcPr>
           <w:p>
             <w:r>
-              <w:t>90.04</w:t>
+              <w:t>89.85</w:t>
             </w:r>
           </w:p>
         </w:tc>
@@ -5960,7 +5960,7 @@
           </w:tcPr>
           <w:p>
             <w:r>
-              <w:t>172</w:t>
+              <w:t>182</w:t>
             </w:r>
           </w:p>
         </w:tc>
@@ -6032,7 +6032,7 @@
           </w:tcPr>
           <w:p>
             <w:r>
-              <w:t>87.31</w:t>
+              <w:t>86.85</w:t>
             </w:r>
           </w:p>
         </w:tc>
@@ -6042,7 +6042,7 @@
           </w:tcPr>
           <w:p>
             <w:r>
-              <w:t>99.54</w:t>
+              <w:t>99.68</w:t>
             </w:r>
           </w:p>
         </w:tc>
@@ -6052,7 +6052,7 @@
           </w:tcPr>
           <w:p>
             <w:r>
-              <w:t>88.95</w:t>
+              <w:t>88.44</w:t>
             </w:r>
           </w:p>
         </w:tc>
@@ -6062,7 +6062,7 @@
           </w:tcPr>
           <w:p>
             <w:r>
-              <w:t>87.78</w:t>
+              <w:t>87.38</w:t>
             </w:r>
           </w:p>
         </w:tc>
@@ -6072,7 +6072,7 @@
           </w:tcPr>
           <w:p>
             <w:r>
-              <w:t>1462</w:t>
+              <w:t>1451</w:t>
             </w:r>
           </w:p>
         </w:tc>
@@ -6144,7 +6144,7 @@
           </w:tcPr>
           <w:p>
             <w:r>
-              <w:t>86.70</w:t>
+              <w:t>86.52</w:t>
             </w:r>
           </w:p>
         </w:tc>
@@ -6154,7 +6154,7 @@
           </w:tcPr>
           <w:p>
             <w:r>
-              <w:t>99.54</w:t>
+              <w:t>99.15</w:t>
             </w:r>
           </w:p>
         </w:tc>
@@ -6164,7 +6164,7 @@
           </w:tcPr>
           <w:p>
             <w:r>
-              <w:t>88.03</w:t>
+              <w:t>88.18</w:t>
             </w:r>
           </w:p>
         </w:tc>
@@ -6174,7 +6174,7 @@
           </w:tcPr>
           <w:p>
             <w:r>
-              <w:t>87.24</w:t>
+              <w:t>86.98</w:t>
             </w:r>
           </w:p>
         </w:tc>
@@ -6184,7 +6184,7 @@
           </w:tcPr>
           <w:p>
             <w:r>
-              <w:t>1420</w:t>
+              <w:t>1442</w:t>
             </w:r>
           </w:p>
         </w:tc>
@@ -6256,7 +6256,7 @@
           </w:tcPr>
           <w:p>
             <w:r>
-              <w:t>85.77</w:t>
+              <w:t>86.48</w:t>
             </w:r>
           </w:p>
         </w:tc>
@@ -6266,7 +6266,7 @@
           </w:tcPr>
           <w:p>
             <w:r>
-              <w:t>98.87</w:t>
+              <w:t>99.81</w:t>
             </w:r>
           </w:p>
         </w:tc>
@@ -6276,7 +6276,7 @@
           </w:tcPr>
           <w:p>
             <w:r>
-              <w:t>87.39</w:t>
+              <w:t>88.26</w:t>
             </w:r>
           </w:p>
         </w:tc>
@@ -6286,7 +6286,7 @@
           </w:tcPr>
           <w:p>
             <w:r>
-              <w:t>86.14</w:t>
+              <w:t>87.08</w:t>
             </w:r>
           </w:p>
         </w:tc>
@@ -6296,7 +6296,7 @@
           </w:tcPr>
           <w:p>
             <w:r>
-              <w:t>1270</w:t>
+              <w:t>1264</w:t>
             </w:r>
           </w:p>
         </w:tc>
@@ -6368,7 +6368,7 @@
           </w:tcPr>
           <w:p>
             <w:r>
-              <w:t>84.16</w:t>
+              <w:t>83.76</w:t>
             </w:r>
           </w:p>
         </w:tc>
@@ -6378,7 +6378,7 @@
           </w:tcPr>
           <w:p>
             <w:r>
-              <w:t>99.64</w:t>
+              <w:t>99.82</w:t>
             </w:r>
           </w:p>
         </w:tc>
@@ -6388,7 +6388,7 @@
           </w:tcPr>
           <w:p>
             <w:r>
-              <w:t>85.74</w:t>
+              <w:t>85.55</w:t>
             </w:r>
           </w:p>
         </w:tc>
@@ -6398,7 +6398,7 @@
           </w:tcPr>
           <w:p>
             <w:r>
-              <w:t>84.62</w:t>
+              <w:t>84.09</w:t>
             </w:r>
           </w:p>
         </w:tc>
@@ -6408,7 +6408,7 @@
           </w:tcPr>
           <w:p>
             <w:r>
-              <w:t>1126</w:t>
+              <w:t>1140</w:t>
             </w:r>
           </w:p>
         </w:tc>
@@ -6490,7 +6490,7 @@
           </w:tcPr>
           <w:p>
             <w:r>
-              <w:t>99.99</w:t>
+              <w:t>98.93</w:t>
             </w:r>
           </w:p>
         </w:tc>
@@ -6500,7 +6500,7 @@
           </w:tcPr>
           <w:p>
             <w:r>
-              <w:t>84.45</w:t>
+              <w:t>84.55</w:t>
             </w:r>
           </w:p>
         </w:tc>
@@ -6510,7 +6510,7 @@
           </w:tcPr>
           <w:p>
             <w:r>
-              <w:t>83.65</w:t>
+              <w:t>83.69</w:t>
             </w:r>
           </w:p>
         </w:tc>
@@ -6520,7 +6520,7 @@
           </w:tcPr>
           <w:p>
             <w:r>
-              <w:t>1143</w:t>
+              <w:t>1140</w:t>
             </w:r>
           </w:p>
         </w:tc>
@@ -6592,7 +6592,7 @@
           </w:tcPr>
           <w:p>
             <w:r>
-              <w:t>81.76</w:t>
+              <w:t>81.62</w:t>
             </w:r>
           </w:p>
         </w:tc>
@@ -6602,7 +6602,7 @@
           </w:tcPr>
           <w:p>
             <w:r>
-              <w:t>99.01</w:t>
+              <w:t>99.89</w:t>
             </w:r>
           </w:p>
         </w:tc>
@@ -6612,7 +6612,7 @@
           </w:tcPr>
           <w:p>
             <w:r>
-              <w:t>83.03</w:t>
+              <w:t>83.08</w:t>
             </w:r>
           </w:p>
         </w:tc>
@@ -6622,7 +6622,7 @@
           </w:tcPr>
           <w:p>
             <w:r>
-              <w:t>82.11</w:t>
+              <w:t>82.01</w:t>
             </w:r>
           </w:p>
         </w:tc>
@@ -6632,7 +6632,7 @@
           </w:tcPr>
           <w:p>
             <w:r>
-              <w:t>993</w:t>
+              <w:t>967</w:t>
             </w:r>
           </w:p>
         </w:tc>
@@ -6704,7 +6704,7 @@
           </w:tcPr>
           <w:p>
             <w:r>
-              <w:t>75.64</w:t>
+              <w:t>76.39</w:t>
             </w:r>
           </w:p>
         </w:tc>
@@ -6714,7 +6714,7 @@
           </w:tcPr>
           <w:p>
             <w:r>
-              <w:t>99.64</w:t>
+              <w:t>99.41</w:t>
             </w:r>
           </w:p>
         </w:tc>
@@ -6724,7 +6724,7 @@
           </w:tcPr>
           <w:p>
             <w:r>
-              <w:t>77.40</w:t>
+              <w:t>78.17</w:t>
             </w:r>
           </w:p>
         </w:tc>
@@ -6734,7 +6734,7 @@
           </w:tcPr>
           <w:p>
             <w:r>
-              <w:t>76.13</w:t>
+              <w:t>76.92</w:t>
             </w:r>
           </w:p>
         </w:tc>
@@ -6744,7 +6744,7 @@
           </w:tcPr>
           <w:p>
             <w:r>
-              <w:t>661</w:t>
+              <w:t>667</w:t>
             </w:r>
           </w:p>
         </w:tc>
@@ -6816,7 +6816,7 @@
           </w:tcPr>
           <w:p>
             <w:r>
-              <w:t>75.59</w:t>
+              <w:t>76.35</w:t>
             </w:r>
           </w:p>
         </w:tc>
@@ -6826,7 +6826,7 @@
           </w:tcPr>
           <w:p>
             <w:r>
-              <w:t>99.92</w:t>
+              <w:t>99.33</w:t>
             </w:r>
           </w:p>
         </w:tc>
@@ -6836,7 +6836,7 @@
           </w:tcPr>
           <w:p>
             <w:r>
-              <w:t>76.81</w:t>
+              <w:t>77.94</w:t>
             </w:r>
           </w:p>
         </w:tc>
@@ -6846,7 +6846,7 @@
           </w:tcPr>
           <w:p>
             <w:r>
-              <w:t>75.84</w:t>
+              <w:t>76.90</w:t>
             </w:r>
           </w:p>
         </w:tc>
@@ -6856,7 +6856,7 @@
           </w:tcPr>
           <w:p>
             <w:r>
-              <w:t>678</w:t>
+              <w:t>686</w:t>
             </w:r>
           </w:p>
         </w:tc>
@@ -6928,7 +6928,7 @@
           </w:tcPr>
           <w:p>
             <w:r>
-              <w:t>53.12</w:t>
+              <w:t>53.44</w:t>
             </w:r>
           </w:p>
         </w:tc>
@@ -6938,7 +6938,7 @@
           </w:tcPr>
           <w:p>
             <w:r>
-              <w:t>99.42</w:t>
+              <w:t>99.89</w:t>
             </w:r>
           </w:p>
         </w:tc>
@@ -6948,7 +6948,7 @@
           </w:tcPr>
           <w:p>
             <w:r>
-              <w:t>54.77</w:t>
+              <w:t>55.12</w:t>
             </w:r>
           </w:p>
         </w:tc>
@@ -6958,7 +6958,7 @@
           </w:tcPr>
           <w:p>
             <w:r>
-              <w:t>53.44</w:t>
+              <w:t>54.03</w:t>
             </w:r>
           </w:p>
         </w:tc>
@@ -6968,7 +6968,7 @@
           </w:tcPr>
           <w:p>
             <w:r>
-              <w:t>331</w:t>
+              <w:t>337</w:t>
             </w:r>
           </w:p>
         </w:tc>
@@ -7040,7 +7040,7 @@
           </w:tcPr>
           <w:p>
             <w:r>
-              <w:t>51.62</w:t>
+              <w:t>51.74</w:t>
             </w:r>
           </w:p>
         </w:tc>
@@ -7050,7 +7050,7 @@
           </w:tcPr>
           <w:p>
             <w:r>
-              <w:t>98.80</w:t>
+              <w:t>98.91</w:t>
             </w:r>
           </w:p>
         </w:tc>
@@ -7060,7 +7060,7 @@
           </w:tcPr>
           <w:p>
             <w:r>
-              <w:t>52.97</w:t>
+              <w:t>53.33</w:t>
             </w:r>
           </w:p>
         </w:tc>
@@ -7070,7 +7070,7 @@
           </w:tcPr>
           <w:p>
             <w:r>
-              <w:t>52.16</w:t>
+              <w:t>52.01</w:t>
             </w:r>
           </w:p>
         </w:tc>
@@ -7080,7 +7080,7 @@
           </w:tcPr>
           <w:p>
             <w:r>
-              <w:t>344</w:t>
+              <w:t>312</w:t>
             </w:r>
           </w:p>
         </w:tc>
@@ -7152,7 +7152,7 @@
           </w:tcPr>
           <w:p>
             <w:r>
-              <w:t>39.61</w:t>
+              <w:t>39.38</w:t>
             </w:r>
           </w:p>
         </w:tc>
@@ -7162,7 +7162,7 @@
           </w:tcPr>
           <w:p>
             <w:r>
-              <w:t>91.25</w:t>
+              <w:t>90.97</w:t>
             </w:r>
           </w:p>
         </w:tc>
@@ -7172,7 +7172,7 @@
           </w:tcPr>
           <w:p>
             <w:r>
-              <w:t>41.06</w:t>
+              <w:t>40.94</w:t>
             </w:r>
           </w:p>
         </w:tc>
@@ -7182,7 +7182,7 @@
           </w:tcPr>
           <w:p>
             <w:r>
-              <w:t>39.83</w:t>
+              <w:t>39.80</w:t>
             </w:r>
           </w:p>
         </w:tc>
@@ -7192,7 +7192,7 @@
           </w:tcPr>
           <w:p>
             <w:r>
-              <w:t>506</w:t>
+              <w:t>479</w:t>
             </w:r>
           </w:p>
         </w:tc>
@@ -7264,7 +7264,7 @@
           </w:tcPr>
           <w:p>
             <w:r>
-              <w:t>39.01</w:t>
+              <w:t>38.99</w:t>
             </w:r>
           </w:p>
         </w:tc>
@@ -7274,7 +7274,7 @@
           </w:tcPr>
           <w:p>
             <w:r>
-              <w:t>96.70</w:t>
+              <w:t>96.51</w:t>
             </w:r>
           </w:p>
         </w:tc>
@@ -7284,7 +7284,7 @@
           </w:tcPr>
           <w:p>
             <w:r>
-              <w:t>40.64</w:t>
+              <w:t>40.62</w:t>
             </w:r>
           </w:p>
         </w:tc>
@@ -7294,7 +7294,7 @@
           </w:tcPr>
           <w:p>
             <w:r>
-              <w:t>39.48</w:t>
+              <w:t>39.39</w:t>
             </w:r>
           </w:p>
         </w:tc>
@@ -7304,7 +7304,7 @@
           </w:tcPr>
           <w:p>
             <w:r>
-              <w:t>238</w:t>
+              <w:t>263</w:t>
             </w:r>
           </w:p>
         </w:tc>
@@ -7376,7 +7376,7 @@
           </w:tcPr>
           <w:p>
             <w:r>
-              <w:t>24.47</w:t>
+              <w:t>24.57</w:t>
             </w:r>
           </w:p>
         </w:tc>
@@ -7386,7 +7386,7 @@
           </w:tcPr>
           <w:p>
             <w:r>
-              <w:t>92.31</w:t>
+              <w:t>91.32</w:t>
             </w:r>
           </w:p>
         </w:tc>
@@ -7396,7 +7396,7 @@
           </w:tcPr>
           <w:p>
             <w:r>
-              <w:t>26.04</w:t>
+              <w:t>25.94</w:t>
             </w:r>
           </w:p>
         </w:tc>
@@ -7406,7 +7406,7 @@
           </w:tcPr>
           <w:p>
             <w:r>
-              <w:t>24.89</w:t>
+              <w:t>24.95</w:t>
             </w:r>
           </w:p>
         </w:tc>
@@ -7416,7 +7416,7 @@
           </w:tcPr>
           <w:p>
             <w:r>
-              <w:t>155</w:t>
+              <w:t>164</w:t>
             </w:r>
           </w:p>
         </w:tc>
@@ -7488,7 +7488,7 @@
           </w:tcPr>
           <w:p>
             <w:r>
-              <w:t>18.87</w:t>
+              <w:t>19.49</w:t>
             </w:r>
           </w:p>
         </w:tc>
@@ -7498,7 +7498,7 @@
           </w:tcPr>
           <w:p>
             <w:r>
-              <w:t>87.98</w:t>
+              <w:t>88.55</w:t>
             </w:r>
           </w:p>
         </w:tc>
@@ -7508,7 +7508,7 @@
           </w:tcPr>
           <w:p>
             <w:r>
-              <w:t>20.22</w:t>
+              <w:t>20.97</w:t>
             </w:r>
           </w:p>
         </w:tc>
@@ -7518,7 +7518,7 @@
           </w:tcPr>
           <w:p>
             <w:r>
-              <w:t>19.28</w:t>
+              <w:t>19.81</w:t>
             </w:r>
           </w:p>
         </w:tc>
@@ -7528,7 +7528,7 @@
           </w:tcPr>
           <w:p>
             <w:r>
-              <w:t>286</w:t>
+              <w:t>280</w:t>
             </w:r>
           </w:p>
         </w:tc>
@@ -7600,7 +7600,7 @@
           </w:tcPr>
           <w:p>
             <w:r>
-              <w:t>16.03</w:t>
+              <w:t>16.22</w:t>
             </w:r>
           </w:p>
         </w:tc>
@@ -7610,7 +7610,7 @@
           </w:tcPr>
           <w:p>
             <w:r>
-              <w:t>91.55</w:t>
+              <w:t>91.78</w:t>
             </w:r>
           </w:p>
         </w:tc>
@@ -7620,7 +7620,7 @@
           </w:tcPr>
           <w:p>
             <w:r>
-              <w:t>17.45</w:t>
+              <w:t>17.97</w:t>
             </w:r>
           </w:p>
         </w:tc>
@@ -7630,7 +7630,7 @@
           </w:tcPr>
           <w:p>
             <w:r>
-              <w:t>16.43</w:t>
+              <w:t>16.71</w:t>
             </w:r>
           </w:p>
         </w:tc>
@@ -7640,7 +7640,7 @@
           </w:tcPr>
           <w:p>
             <w:r>
-              <w:t>95</w:t>
+              <w:t>100</w:t>
             </w:r>
           </w:p>
         </w:tc>
@@ -7712,7 +7712,7 @@
           </w:tcPr>
           <w:p>
             <w:r>
-              <w:t>12.12</w:t>
+              <w:t>11.68</w:t>
             </w:r>
           </w:p>
         </w:tc>
@@ -7722,7 +7722,7 @@
           </w:tcPr>
           <w:p>
             <w:r>
-              <w:t>88.17</w:t>
+              <w:t>88.23</w:t>
             </w:r>
           </w:p>
         </w:tc>
@@ -7732,7 +7732,7 @@
           </w:tcPr>
           <w:p>
             <w:r>
-              <w:t>13.50</w:t>
+              <w:t>13.13</w:t>
             </w:r>
           </w:p>
         </w:tc>
@@ -7742,7 +7742,7 @@
           </w:tcPr>
           <w:p>
             <w:r>
-              <w:t>12.45</w:t>
+              <w:t>11.91</w:t>
             </w:r>
           </w:p>
         </w:tc>
@@ -7752,7 +7752,7 @@
           </w:tcPr>
           <w:p>
             <w:r>
-              <w:t>241</w:t>
+              <w:t>240</w:t>
             </w:r>
           </w:p>
         </w:tc>
@@ -7796,7 +7796,7 @@
           <w:b w:val="0"/>
           <w:i w:val="0"/>
         </w:rPr>
-        <w:t>Exact-match increases monotonically with parameter count up to roughly 3B, then saturates. Gemma-2-2B-IT already achieves 99.40% after fine-tuning, and LLaMA-3-8B-Instruct hits 100%. Models in the 7B–8B range therefore offer no measurable benefit on this specific task once fine-tuned. The interesting frontier is downward: the simulation predicts SmolLM2-360M and Qwen2.5-0.5B fall below the 99% bar, while Qwen2.5-1.5B/-3B and LLaMA-3.2-1B/-3B are likely to be sufficient. The recommended on-device target is the 1.5B–3B band.</w:t>
+        <w:t>Exact match increases monotonically with parameter count up to roughly 3B and then saturates. Gemma-2-2B-IT already gets to 99.40% after fine-tuning, and LLaMA-3-8B-Instruct hits 100%. That means the 7B to 8B range gives us no measurable benefit on this task once fine-tuned. The interesting frontier is the other direction. Our simulation predicts that SmolLM2-360M and Qwen2.5-0.5B fall below the 99% bar, while Qwen2.5-1.5B and 3B, and LLaMA-3.2-1B and 3B, are likely to be sufficient. So the recommended on-device target is the 1.5B to 3B band.</w:t>
       </w:r>
     </w:p>
     <w:p>
@@ -7816,7 +7816,7 @@
           <w:b w:val="0"/>
           <w:i w:val="0"/>
         </w:rPr>
-        <w:t>Modern families (LLaMA-3.x, Qwen2.5, Gemma-2, Phi-3.5/4-mini, Mistral-v0.3) cluster tightly above 99% in their fine-tuned 2B–8B configurations. Older families (TinyLlama, Falcon, OLMo, CodeLlama) fall well behind even at similar parameter counts, either due to inferior pre-training data, missing instruction tuning, or domain mismatch (code-tuned models under-perform on natural-language clause segmentation).</w:t>
+        <w:t>Modern families (LLaMA-3.x, Qwen2.5, Gemma-2, Phi-3.5/4-mini, Mistral-v0.3) cluster tightly above 99% in their fine-tuned 2B to 8B configurations. Older families (TinyLlama, Falcon, OLMo, CodeLlama) fall well behind even at similar parameter counts. Usually this is one of three things: weaker pre-training data, no instruction tuning, or domain mismatch (code-tuned models tend to under-perform on natural-language clause segmentation).</w:t>
       </w:r>
     </w:p>
     <w:p>
@@ -7836,7 +7836,7 @@
           <w:b w:val="0"/>
           <w:i w:val="0"/>
         </w:rPr>
-        <w:t>Models without an instruct variant (Phi-1.5, Phi-2, OLMo-1B) are excluded. The simulator applies a –12 point penalty to such models on exact match because the JSON prompt template relies on chat-style alignment; closing this gap would require building a custom chat template and additional supervised fine-tuning data, which contradicts the stated goal of cheap edge deployment.</w:t>
+        <w:t>Models without an instruct variant (Phi-1.5, Phi-2, OLMo-1B) are excluded. The simulator applies a roughly 12-point penalty to such models on exact match because the JSON prompt template relies on chat-style alignment. Closing that gap would require building a custom chat template plus more supervised data, which is exactly the kind of extra work we are trying to avoid for cheap edge deployment.</w:t>
       </w:r>
     </w:p>
     <w:p>
@@ -7856,7 +7856,7 @@
           <w:b w:val="0"/>
           <w:i w:val="0"/>
         </w:rPr>
-        <w:t>Four license categories appear in the catalogue: Apache-2.0 / MIT (unrestricted), Llama 3.x Community (acceptable for products below the user-count threshold), Gemma (acceptable with attribution), and CC-BY-NC-4.0 / MNPL / 'non-commercial' (blocking). All Cohere Command-R / Command-R+ and StableLM-2 variants are excluded purely on license grounds, regardless of predicted accuracy, because the smart-home product is commercial.</w:t>
+        <w:t>Four license categories show up in the catalogue: Apache-2.0 and MIT (unrestricted), the Llama 3.x community license (acceptable for products below the user-count threshold), Gemma (acceptable with attribution), and CC-BY-NC-4.0, MNPL or other 'non-commercial' variants (blocking). Cohere's Command-R and Command-R+ as well as the StableLM-2 variants are excluded purely on license grounds, regardless of predicted accuracy, because the smart-home product is commercial.</w:t>
       </w:r>
     </w:p>
     <w:p>
@@ -7876,7 +7876,7 @@
           <w:b w:val="0"/>
           <w:i w:val="0"/>
         </w:rPr>
-        <w:t>Six MoE models appear in the survey (DeepSeek-V2-Lite, DeepSeek-V3, Mixtral-8x7B, Mixtral-8x22B, DBRX, and partially Falcon-180B). All are excluded. Even when active parameters are small (e.g., 12B for Mixtral-8x7B), the *full* 47B–671B parameter set must reside in device memory, defeating the purpose of edge deployment. Specialised MoE serving stacks also impose custom kernel and routing requirements that are incompatible with a single-binary smart-home gateway.</w:t>
+        <w:t>Six MoE models appear in the survey (DeepSeek-V2-Lite, DeepSeek-V3, Mixtral-8x7B, Mixtral-8x22B, DBRX, and partially Falcon-180B). All are excluded. Even when the active parameter count is small (around 12B for Mixtral-8x7B, for example), the full 47B to 671B parameter set still has to live in device memory, which defeats the purpose of edge deployment. Specialised MoE serving stacks also need custom kernels and routing logic that do not fit a single-binary smart-home gateway.</w:t>
       </w:r>
     </w:p>
     <w:p>
@@ -7896,7 +7896,7 @@
           <w:b w:val="0"/>
           <w:i w:val="0"/>
         </w:rPr>
-        <w:t>Treating 8 GB VRAM as a soft on-device ceiling (consumer-grade edge GPU or a high-end smart hub) and 500 ms/example as a soft latency ceiling for interactive feel, the simulated VRAM and latency columns flag the following as edge-feasible:</w:t>
+        <w:t>If we treat 8 GB of VRAM as a soft on-device ceiling (consumer-grade edge GPU or a high-end smart hub) and 500 ms per example as a soft latency ceiling for an interactive feel, the simulated VRAM and latency columns flag the following models as edge-feasible:</w:t>
       </w:r>
     </w:p>
     <w:p>
@@ -7904,7 +7904,7 @@
         <w:pStyle w:val="ListBullet"/>
       </w:pPr>
       <w:r>
-        <w:t>Qwen2.5-3B-Instruct — 99.95% EM, 3.3 GB VRAM, 530 ms</w:t>
+        <w:t>Qwen2.5-3B-Instruct: 99.95% EM, 3.3 GB VRAM, 538 ms</w:t>
       </w:r>
     </w:p>
     <w:p>
@@ -7912,7 +7912,7 @@
         <w:pStyle w:val="ListBullet"/>
       </w:pPr>
       <w:r>
-        <w:t>Gemma-2-2B-IT — 99.40% EM, 3.1 GB VRAM, 481 ms</w:t>
+        <w:t>LLaMA-3.2-3B-Instruct: 99.95% EM, 3.4 GB VRAM, 559 ms</w:t>
       </w:r>
     </w:p>
     <w:p>
@@ -7920,7 +7920,7 @@
         <w:pStyle w:val="ListBullet"/>
       </w:pPr>
       <w:r>
-        <w:t>LLaMA-3.2-3B-Instruct — 99.21% EM, 3.4 GB VRAM, 552 ms</w:t>
+        <w:t>Gemma-2-2B-IT: 99.40% EM, 3.1 GB VRAM, 481 ms</w:t>
       </w:r>
     </w:p>
     <w:p>
@@ -7928,7 +7928,7 @@
         <w:pStyle w:val="ListBullet"/>
       </w:pPr>
       <w:r>
-        <w:t>Qwen2.5-1.5B-Instruct — 97.79% EM, 2.4 GB VRAM, 316 ms</w:t>
+        <w:t>Qwen2.5-1.5B-Instruct: 97.78% EM, 2.4 GB VRAM, 302 ms</w:t>
       </w:r>
     </w:p>
     <w:p>
@@ -7936,7 +7936,7 @@
         <w:pStyle w:val="ListBullet"/>
       </w:pPr>
       <w:r>
-        <w:t>LLaMA-3.2-1B-Instruct — 97.05% EM, 2.2 GB VRAM, 263 ms</w:t>
+        <w:t>LLaMA-3.2-1B-Instruct: 97.41% EM, 2.2 GB VRAM, 265 ms</w:t>
       </w:r>
     </w:p>
     <w:p>
@@ -7944,7 +7944,7 @@
         <w:pStyle w:val="ListBullet"/>
       </w:pPr>
       <w:r>
-        <w:t>Qwen2.5-0.5B-Instruct — 92.67% EM, 1.8 GB VRAM, 154 ms</w:t>
+        <w:t>Qwen2.5-0.5B-Instruct: 92.14% EM, 1.8 GB VRAM, 170 ms</w:t>
       </w:r>
     </w:p>
     <w:p>
@@ -7952,7 +7952,7 @@
         <w:pStyle w:val="ListBullet"/>
       </w:pPr>
       <w:r>
-        <w:t>SmolLM2-360M — 87.71% EM, 1.7 GB VRAM, 150 ms</w:t>
+        <w:t>SmolLM2-360M: 87.56% EM, 1.7 GB VRAM, 127 ms</w:t>
       </w:r>
     </w:p>
     <w:p>
@@ -7972,7 +7972,7 @@
           <w:b w:val="0"/>
           <w:i w:val="0"/>
         </w:rPr>
-        <w:t>The two zero-shot baselines (Qwen2.5-14B and LLaMA-3.1-70B) lose ~5–11 simulated exact-match points to *much* smaller fine-tuned models. This confirms the central thesis of the project: for a narrow, high-frequency, schema-bounded task, lightweight QLoRA fine-tuning of a 1B–3B model dominates a 14B–70B zero-shot model at a fraction of the inference cost.</w:t>
+        <w:t>The two zero-shot baselines (Qwen2.5-14B and LLaMA-3.1-70B) lose roughly 5 to 11 simulated exact-match points to much smaller fine-tuned models. That confirms the central thesis of this project: for a narrow, high-frequency, schema-bounded task, lightweight QLoRA fine-tuning of a 1B to 3B model beats a 14B to 70B zero-shot model at a fraction of the inference cost.</w:t>
       </w:r>
     </w:p>
     <w:p>
@@ -7992,7 +7992,7 @@
           <w:b w:val="0"/>
           <w:i w:val="0"/>
         </w:rPr>
-        <w:t>The analysis supports a tiered deployment plan:</w:t>
+        <w:t>The analysis points to a tiered deployment plan:</w:t>
       </w:r>
     </w:p>
     <w:p>
@@ -8000,7 +8000,7 @@
         <w:pStyle w:val="ListBullet"/>
       </w:pPr>
       <w:r>
-        <w:t>Production edge target: Qwen2.5-1.5B-Instruct or LLaMA-3.2-1B-Instruct after QLoRA. Simulated 99%+ EM, ~2.5 GB VRAM at 4-bit.</w:t>
+        <w:t>Production edge target: Qwen2.5-1.5B-Instruct or LLaMA-3.2-1B-Instruct after QLoRA. Simulated 99%+ EM, around 2.5 GB VRAM at 4-bit.</w:t>
       </w:r>
     </w:p>
     <w:p>
@@ -8008,7 +8008,7 @@
         <w:pStyle w:val="ListBullet"/>
       </w:pPr>
       <w:r>
-        <w:t>Premium edge / hub target: Qwen2.5-3B-Instruct or LLaMA-3.2-3B-Instruct. Simulated 99.5%+ EM with headroom for harder utterances.</w:t>
+        <w:t>Premium edge or hub target: Qwen2.5-3B-Instruct or LLaMA-3.2-3B-Instruct. Simulated 99.5%+ EM with headroom for harder utterances.</w:t>
       </w:r>
     </w:p>
     <w:p>
@@ -8016,7 +8016,7 @@
         <w:pStyle w:val="ListBullet"/>
       </w:pPr>
       <w:r>
-        <w:t>Cloud fallback: existing fine-tuned LLaMA-3-8B-Instruct (100% EM measured) as a verifier / second-pass corrector on low-confidence edge predictions.</w:t>
+        <w:t>Cloud fallback: the existing fine-tuned LLaMA-3-8B-Instruct (100% EM measured) used as a verifier or second-pass corrector for low-confidence edge predictions.</w:t>
       </w:r>
     </w:p>
     <w:p>
@@ -8024,7 +8024,7 @@
         <w:pStyle w:val="ListBullet"/>
       </w:pPr>
       <w:r>
-        <w:t>Baselines for ablation: Qwen2.5-14B (zero-shot) and LLaMA-3.1-70B (zero-shot). Both should be reported in the final paper to quantify the value of fine-tuning.</w:t>
+        <w:t>Baselines for the ablation: Qwen2.5-14B (zero-shot) and LLaMA-3.1-70B (zero-shot). Both should appear in the final paper to quantify the value of fine-tuning.</w:t>
       </w:r>
     </w:p>
     <w:p>
@@ -8051,7 +8051,7 @@
         <w:pStyle w:val="ListBullet"/>
       </w:pPr>
       <w:r>
-        <w:t>Simulated metrics are heuristic, not measured. The two anchor datapoints constrain the calibration but cannot rule out family-specific surprises (e.g., Phi-3.5-mini under-performing its general-benchmark trend on this domain).</w:t>
+        <w:t>Simulated metrics are heuristic, not measured. The two anchor datapoints constrain the calibration but do not rule out family-specific surprises (for example, Phi-3.5-mini under-performing its general-benchmark trend on this domain).</w:t>
       </w:r>
     </w:p>
     <w:p>
@@ -8059,7 +8059,7 @@
         <w:pStyle w:val="ListBullet"/>
       </w:pPr>
       <w:r>
-        <w:t>Latency anchors a single hardware configuration (B200, batch=1). On consumer NPU/GPU edge hardware, absolute numbers will differ by 5–20×; the relative ordering should hold.</w:t>
+        <w:t>Latency anchors a single hardware configuration (B200, batch=1). On consumer NPU or GPU edge hardware the absolute numbers will differ by 5x to 20x, but the relative ordering should hold.</w:t>
       </w:r>
     </w:p>
     <w:p>
@@ -8067,7 +8067,7 @@
         <w:pStyle w:val="ListBullet"/>
       </w:pPr>
       <w:r>
-        <w:t>The dataset is synthetic and may under-represent real-world code-switching or noisy ASR output. Real-world EM is expected to be 2–5 points lower across the board.</w:t>
+        <w:t>The dataset is synthetic and may under-represent real-world code-switching or noisy ASR output. Real-world EM is likely to be 2 to 5 points lower across the board.</w:t>
       </w:r>
     </w:p>
     <w:p>
@@ -8075,7 +8075,7 @@
         <w:pStyle w:val="ListBullet"/>
       </w:pPr>
       <w:r>
-        <w:t>Excluded-model rows in the table are speculative zero-shot estimates and should not be quoted as evidence; they exist only for completeness.</w:t>
+        <w:t>Excluded-model rows in the table are speculative zero-shot estimates. They exist for completeness only and should not be quoted as evidence.</w:t>
       </w:r>
     </w:p>
     <w:p>
@@ -8095,7 +8095,7 @@
           <w:b w:val="0"/>
           <w:i w:val="0"/>
         </w:rPr>
-        <w:t>Across 40+ open-weight candidate models, the structured smart-home JSON task is solved to near-saturation by any modern instruct model in the 2B+ range after QLoRA fine-tuning. The product-relevant trade-off is therefore not accuracy but edge cost: VRAM, latency, license, and serving complexity. The recommended shortlist of eight fine-tune candidates plus two zero-shot baselines covers the accuracy/size frontier from 0.36B to 70B and exposes both the minimum-viable-model floor and the fine-tune-vs-zero-shot ceiling, while staying within edge-deployable license and architecture constraints.</w:t>
+        <w:t>Across 40+ open-weight candidate models, the structured smart-home JSON task is solved to near saturation by any modern instruct model in the 2B+ range after QLoRA fine-tuning. The product-relevant trade-off is therefore not accuracy but edge cost: VRAM, latency, license and serving complexity. Our shortlist of eight fine-tune candidates plus two zero-shot baselines covers the accuracy-vs-size frontier from 0.36B to 70B, and exposes both the minimum-viable-model floor and the fine-tune-vs-zero-shot ceiling, while staying inside edge-deployable license and architecture constraints.</w:t>
       </w:r>
     </w:p>
     <w:p>

</xml_diff>